<commit_message>
Proposal doc: fit to 3 pages
Co-Authored-By: Claude Opus 5.5 <noreply@anthropic.com>
Claude-Session: https://claude.ai/code/session_01RaAHJjFzQLBQzv3hdCW4ED
</commit_message>
<xml_diff>
--- a/cover-proposals/v15_1007_send_pwc/台割3案_構成提案書.docx
+++ b/cover-proposals/v15_1007_send_pwc/台割3案_構成提案書.docx
@@ -1550,11 +1550,6 @@
       </w:r>
     </w:p>
     <w:p>
-      <w:r>
-        <w:br w:type="page"/>
-      </w:r>
-    </w:p>
-    <w:p>
       <w:pPr>
         <w:pStyle w:val="Heading2"/>
       </w:pPr>

</xml_diff>